<commit_message>
cv 1 page update
</commit_message>
<xml_diff>
--- a/assets/CV.docx
+++ b/assets/CV.docx
@@ -10,19 +10,22 @@
         <w:tblLayout w:type="fixed"/>
       </w:tblPr>
       <w:tblGrid>
-        <w:gridCol w:w="5544"/>
-        <w:gridCol w:w="5544"/>
+        <w:gridCol w:w="5688"/>
+        <w:gridCol w:w="5688"/>
       </w:tblGrid>
       <w:tr>
+        <w:trPr>
+          <w:trHeight w:val="14832" w:hRule="exact"/>
+        </w:trPr>
         <w:tc>
           <w:tcPr>
-            <w:tcW w:type="dxa" w:w="3384"/>
+            <w:tcW w:type="dxa" w:w="3312"/>
             <w:shd w:val="clear" w:color="auto" w:fill="D9D3F7"/>
             <w:tcMar>
-              <w:top w:w="200" w:type="dxa"/>
-              <w:left w:w="160" w:type="dxa"/>
-              <w:bottom w:w="160" w:type="dxa"/>
-              <w:right w:w="140" w:type="dxa"/>
+              <w:top w:w="160" w:type="dxa"/>
+              <w:left w:w="140" w:type="dxa"/>
+              <w:bottom w:w="120" w:type="dxa"/>
+              <w:right w:w="120" w:type="dxa"/>
             </w:tcMar>
           </w:tcPr>
           <w:p/>
@@ -55,7 +58,7 @@
           </w:p>
           <w:p>
             <w:pPr>
-              <w:spacing w:after="60" w:before="180"/>
+              <w:spacing w:after="60" w:before="120"/>
             </w:pPr>
             <w:r>
               <w:rPr>
@@ -69,7 +72,7 @@
           </w:p>
           <w:p>
             <w:pPr>
-              <w:spacing w:after="30"/>
+              <w:spacing w:after="20"/>
               <w:ind w:left="230" w:hanging="187"/>
             </w:pPr>
             <w:r>
@@ -91,7 +94,7 @@
           </w:p>
           <w:p>
             <w:pPr>
-              <w:spacing w:after="30"/>
+              <w:spacing w:after="20"/>
               <w:ind w:left="230" w:hanging="187"/>
             </w:pPr>
             <w:r>
@@ -113,7 +116,7 @@
           </w:p>
           <w:p>
             <w:pPr>
-              <w:spacing w:after="30"/>
+              <w:spacing w:after="20"/>
               <w:ind w:left="230" w:hanging="187"/>
             </w:pPr>
             <w:r>
@@ -135,7 +138,7 @@
           </w:p>
           <w:p>
             <w:pPr>
-              <w:spacing w:after="30"/>
+              <w:spacing w:after="20"/>
               <w:ind w:left="230" w:hanging="187"/>
             </w:pPr>
             <w:r>
@@ -157,7 +160,7 @@
           </w:p>
           <w:p>
             <w:pPr>
-              <w:spacing w:after="30"/>
+              <w:spacing w:after="20"/>
               <w:ind w:left="230" w:hanging="187"/>
             </w:pPr>
             <w:r>
@@ -179,7 +182,7 @@
           </w:p>
           <w:p>
             <w:pPr>
-              <w:spacing w:after="60" w:before="180"/>
+              <w:spacing w:after="60" w:before="120"/>
             </w:pPr>
             <w:r>
               <w:rPr>
@@ -245,7 +248,7 @@
           </w:p>
           <w:p>
             <w:pPr>
-              <w:spacing w:after="60" w:before="180"/>
+              <w:spacing w:after="60" w:before="120"/>
             </w:pPr>
             <w:r>
               <w:rPr>
@@ -259,7 +262,7 @@
           </w:p>
           <w:p>
             <w:pPr>
-              <w:spacing w:after="30"/>
+              <w:spacing w:after="20"/>
               <w:ind w:left="230" w:hanging="187"/>
             </w:pPr>
             <w:r>
@@ -274,7 +277,7 @@
           </w:p>
           <w:p>
             <w:pPr>
-              <w:spacing w:after="30"/>
+              <w:spacing w:after="20"/>
               <w:ind w:left="230" w:hanging="187"/>
             </w:pPr>
             <w:r>
@@ -289,7 +292,7 @@
           </w:p>
           <w:p>
             <w:pPr>
-              <w:spacing w:after="30"/>
+              <w:spacing w:after="20"/>
               <w:ind w:left="230" w:hanging="187"/>
             </w:pPr>
             <w:r>
@@ -304,7 +307,7 @@
           </w:p>
           <w:p>
             <w:pPr>
-              <w:spacing w:after="30"/>
+              <w:spacing w:after="20"/>
               <w:ind w:left="230" w:hanging="187"/>
             </w:pPr>
             <w:r>
@@ -319,7 +322,200 @@
           </w:p>
           <w:p>
             <w:pPr>
-              <w:spacing w:after="60" w:before="180"/>
+              <w:spacing w:after="60" w:before="120"/>
+            </w:pPr>
+            <w:r>
+              <w:rPr>
+                <w:b/>
+                <w:i w:val="0"/>
+                <w:sz w:val="20"/>
+                <w:spacing w:val="30"/>
+              </w:rPr>
+              <w:t>SELECTED PROJECTS</w:t>
+            </w:r>
+          </w:p>
+          <w:p>
+            <w:pPr>
+              <w:spacing w:after="40"/>
+            </w:pPr>
+            <w:hyperlink r:id="rId9">
+              <w:r>
+                <w:rPr>
+                  <w:color w:val="1155CC"/>
+                  <w:u w:val="single"/>
+                  <w:sz w:val="17"/>
+                </w:rPr>
+                <w:t xml:space="preserve">Relocation Insights App</w:t>
+              </w:r>
+            </w:hyperlink>
+            <w:r>
+              <w:rPr>
+                <w:sz w:val="17"/>
+              </w:rPr>
+              <w:t>: LangChain + Gen AI chatbot, 95% user satisfaction</w:t>
+            </w:r>
+          </w:p>
+          <w:p>
+            <w:pPr>
+              <w:spacing w:after="40"/>
+            </w:pPr>
+            <w:hyperlink r:id="rId10">
+              <w:r>
+                <w:rPr>
+                  <w:color w:val="1155CC"/>
+                  <w:u w:val="single"/>
+                  <w:sz w:val="17"/>
+                </w:rPr>
+                <w:t xml:space="preserve">Olympic Swimming Analysis</w:t>
+              </w:r>
+            </w:hyperlink>
+            <w:r>
+              <w:rPr>
+                <w:sz w:val="17"/>
+              </w:rPr>
+              <w:t>: 100+ yrs of data, forecasting</w:t>
+            </w:r>
+          </w:p>
+          <w:p>
+            <w:pPr>
+              <w:spacing w:after="40"/>
+            </w:pPr>
+            <w:hyperlink r:id="rId11">
+              <w:r>
+                <w:rPr>
+                  <w:color w:val="1155CC"/>
+                  <w:u w:val="single"/>
+                  <w:sz w:val="17"/>
+                </w:rPr>
+                <w:t xml:space="preserve">Banking Interface System</w:t>
+              </w:r>
+            </w:hyperlink>
+            <w:r>
+              <w:rPr>
+                <w:sz w:val="17"/>
+              </w:rPr>
+              <w:t>: secure conversational transactions</w:t>
+            </w:r>
+          </w:p>
+          <w:p>
+            <w:pPr>
+              <w:spacing w:after="40"/>
+            </w:pPr>
+            <w:hyperlink r:id="rId12">
+              <w:r>
+                <w:rPr>
+                  <w:color w:val="1155CC"/>
+                  <w:u w:val="single"/>
+                  <w:sz w:val="17"/>
+                </w:rPr>
+                <w:t xml:space="preserve">Obesity Classification</w:t>
+              </w:r>
+            </w:hyperlink>
+            <w:r>
+              <w:rPr>
+                <w:sz w:val="17"/>
+              </w:rPr>
+              <w:t>: ML health-factor model</w:t>
+            </w:r>
+          </w:p>
+          <w:p>
+            <w:pPr>
+              <w:spacing w:after="40"/>
+            </w:pPr>
+            <w:hyperlink r:id="rId13">
+              <w:r>
+                <w:rPr>
+                  <w:color w:val="1155CC"/>
+                  <w:u w:val="single"/>
+                  <w:sz w:val="17"/>
+                </w:rPr>
+                <w:t xml:space="preserve">Indigenous Vegetables</w:t>
+              </w:r>
+            </w:hyperlink>
+            <w:r>
+              <w:rPr>
+                <w:sz w:val="17"/>
+              </w:rPr>
+              <w:t>: Rutgers nutritional research</w:t>
+            </w:r>
+          </w:p>
+          <w:p>
+            <w:pPr>
+              <w:spacing w:after="60" w:before="120"/>
+            </w:pPr>
+            <w:r>
+              <w:rPr>
+                <w:b/>
+                <w:i w:val="0"/>
+                <w:sz w:val="20"/>
+                <w:spacing w:val="30"/>
+              </w:rPr>
+              <w:t>ACHIEVEMENTS</w:t>
+            </w:r>
+          </w:p>
+          <w:p>
+            <w:pPr>
+              <w:spacing w:after="20"/>
+              <w:ind w:left="230" w:hanging="187"/>
+            </w:pPr>
+            <w:r>
+              <w:t xml:space="preserve">•  </w:t>
+            </w:r>
+            <w:r>
+              <w:rPr>
+                <w:sz w:val="17"/>
+              </w:rPr>
+              <w:t>Vector Marketing President's Club inductee</w:t>
+            </w:r>
+          </w:p>
+          <w:p>
+            <w:pPr>
+              <w:spacing w:after="20"/>
+              <w:ind w:left="230" w:hanging="187"/>
+            </w:pPr>
+            <w:r>
+              <w:t xml:space="preserve">•  </w:t>
+            </w:r>
+            <w:r>
+              <w:rPr>
+                <w:sz w:val="17"/>
+              </w:rPr>
+              <w:t>Nominee, 2018 Student Employee of the Year (top 60 of 12,500 student employees), Rutgers</w:t>
+            </w:r>
+          </w:p>
+          <w:p>
+            <w:pPr>
+              <w:spacing w:after="20"/>
+              <w:ind w:left="230" w:hanging="187"/>
+            </w:pPr>
+            <w:r>
+              <w:t xml:space="preserve">•  </w:t>
+            </w:r>
+            <w:r>
+              <w:rPr>
+                <w:sz w:val="17"/>
+              </w:rPr>
+              <w:t>Joyce Family Scholarship</w:t>
+            </w:r>
+          </w:p>
+          <w:p>
+            <w:pPr>
+              <w:spacing w:after="20"/>
+              <w:ind w:left="230" w:hanging="187"/>
+            </w:pPr>
+            <w:r>
+              <w:t xml:space="preserve">•  </w:t>
+            </w:r>
+            <w:r>
+              <w:rPr>
+                <w:sz w:val="17"/>
+              </w:rPr>
+              <w:t>Research: Catnip Oils (2019), Environmental Impact (2018), Indigenous Vegetables (2022), Nutritional Analysis (2024)</w:t>
+            </w:r>
+          </w:p>
+          <w:p>
+            <w:pPr>
+              <w:spacing w:after="60" w:before="120"/>
             </w:pPr>
             <w:r>
               <w:rPr>
@@ -335,7 +531,7 @@
             <w:pPr>
               <w:spacing w:after="20" w:before="0"/>
             </w:pPr>
-            <w:hyperlink r:id="rId9">
+            <w:hyperlink r:id="rId14">
               <w:r>
                 <w:rPr>
                   <w:color w:val="1155CC"/>
@@ -350,7 +546,7 @@
             <w:pPr>
               <w:spacing w:after="20" w:before="0"/>
             </w:pPr>
-            <w:hyperlink r:id="rId10">
+            <w:hyperlink r:id="rId15">
               <w:r>
                 <w:rPr>
                   <w:color w:val="1155CC"/>
@@ -365,7 +561,7 @@
             <w:pPr>
               <w:spacing w:after="20" w:before="0"/>
             </w:pPr>
-            <w:hyperlink r:id="rId11">
+            <w:hyperlink r:id="rId16">
               <w:r>
                 <w:rPr>
                   <w:color w:val="1155CC"/>
@@ -379,12 +575,12 @@
         </w:tc>
         <w:tc>
           <w:tcPr>
-            <w:tcW w:type="dxa" w:w="7704"/>
+            <w:tcW w:type="dxa" w:w="8064"/>
             <w:tcMar>
-              <w:top w:w="200" w:type="dxa"/>
-              <w:left w:w="220" w:type="dxa"/>
-              <w:bottom w:w="160" w:type="dxa"/>
-              <w:right w:w="120" w:type="dxa"/>
+              <w:top w:w="160" w:type="dxa"/>
+              <w:left w:w="200" w:type="dxa"/>
+              <w:bottom w:w="120" w:type="dxa"/>
+              <w:right w:w="100" w:type="dxa"/>
             </w:tcMar>
           </w:tcPr>
           <w:p>
@@ -395,7 +591,7 @@
               <w:rPr>
                 <w:b/>
                 <w:i w:val="0"/>
-                <w:sz w:val="60"/>
+                <w:sz w:val="54"/>
               </w:rPr>
               <w:t>La Raven Gordon</w:t>
             </w:r>
@@ -429,7 +625,7 @@
           </w:p>
           <w:p>
             <w:pPr>
-              <w:spacing w:after="60" w:before="180"/>
+              <w:spacing w:after="60" w:before="120"/>
             </w:pPr>
             <w:r>
               <w:rPr>
@@ -468,7 +664,7 @@
           </w:p>
           <w:p>
             <w:pPr>
-              <w:spacing w:after="30"/>
+              <w:spacing w:after="20"/>
               <w:ind w:left="230" w:hanging="187"/>
             </w:pPr>
             <w:r>
@@ -476,14 +672,14 @@
             </w:r>
             <w:r>
               <w:rPr>
-                <w:sz w:val="19"/>
+                <w:sz w:val="18"/>
               </w:rPr>
               <w:t>Train and evaluate frontier LLMs across 28+ confidential enterprise and lab projects: RLHF pipelines, preference ranking, adversarial red-teaming, refusal/logic auditing, and rubric design</w:t>
             </w:r>
           </w:p>
           <w:p>
             <w:pPr>
-              <w:spacing w:after="30"/>
+              <w:spacing w:after="20"/>
               <w:ind w:left="230" w:hanging="187"/>
             </w:pPr>
             <w:r>
@@ -491,14 +687,14 @@
             </w:r>
             <w:r>
               <w:rPr>
-                <w:sz w:val="19"/>
+                <w:sz w:val="18"/>
               </w:rPr>
               <w:t>Trained models for scientific domains (biochemistry, chemistry), improving domain knowledge by 40% through validation frameworks</w:t>
             </w:r>
           </w:p>
           <w:p>
             <w:pPr>
-              <w:spacing w:after="30"/>
+              <w:spacing w:after="20"/>
               <w:ind w:left="230" w:hanging="187"/>
             </w:pPr>
             <w:r>
@@ -506,14 +702,14 @@
             </w:r>
             <w:r>
               <w:rPr>
-                <w:sz w:val="19"/>
+                <w:sz w:val="18"/>
               </w:rPr>
               <w:t>Advise on compliance and ethics: copyright, data privacy, and regulatory exposure in AI-generated content</w:t>
             </w:r>
           </w:p>
           <w:p>
             <w:pPr>
-              <w:spacing w:after="30"/>
+              <w:spacing w:after="20"/>
               <w:ind w:left="230" w:hanging="187"/>
             </w:pPr>
             <w:r>
@@ -521,14 +717,14 @@
             </w:r>
             <w:r>
               <w:rPr>
-                <w:sz w:val="19"/>
+                <w:sz w:val="18"/>
               </w:rPr>
               <w:t>Work under NDA; project names withheld</w:t>
             </w:r>
           </w:p>
           <w:p>
             <w:pPr>
-              <w:spacing w:after="0" w:before="120"/>
+              <w:spacing w:after="0" w:before="80"/>
             </w:pPr>
             <w:r>
               <w:rPr>
@@ -553,7 +749,7 @@
           </w:p>
           <w:p>
             <w:pPr>
-              <w:spacing w:after="30"/>
+              <w:spacing w:after="20"/>
               <w:ind w:left="230" w:hanging="187"/>
             </w:pPr>
             <w:r>
@@ -561,14 +757,14 @@
             </w:r>
             <w:r>
               <w:rPr>
-                <w:sz w:val="19"/>
+                <w:sz w:val="18"/>
               </w:rPr>
               <w:t>Created the Three Brains framework (human judgment, organizational systems, AI tools) and guide clients through readiness assessment, discovery, and integration</w:t>
             </w:r>
           </w:p>
           <w:p>
             <w:pPr>
-              <w:spacing w:after="30"/>
+              <w:spacing w:after="20"/>
               <w:ind w:left="230" w:hanging="187"/>
             </w:pPr>
             <w:r>
@@ -576,14 +772,14 @@
             </w:r>
             <w:r>
               <w:rPr>
-                <w:sz w:val="19"/>
+                <w:sz w:val="18"/>
               </w:rPr>
               <w:t>Drive adoption across analytics, customer service, and internal automation; refer out when AI is not the right fit</w:t>
             </w:r>
           </w:p>
           <w:p>
             <w:pPr>
-              <w:spacing w:after="30"/>
+              <w:spacing w:after="20"/>
               <w:ind w:left="230" w:hanging="187"/>
             </w:pPr>
             <w:r>
@@ -591,14 +787,14 @@
             </w:r>
             <w:r>
               <w:rPr>
-                <w:sz w:val="19"/>
+                <w:sz w:val="18"/>
               </w:rPr>
               <w:t>Publish the AI Brain Clone newsletter on Substack</w:t>
             </w:r>
           </w:p>
           <w:p>
             <w:pPr>
-              <w:spacing w:after="0" w:before="120"/>
+              <w:spacing w:after="0" w:before="80"/>
             </w:pPr>
             <w:r>
               <w:rPr>
@@ -623,7 +819,7 @@
           </w:p>
           <w:p>
             <w:pPr>
-              <w:spacing w:after="30"/>
+              <w:spacing w:after="20"/>
               <w:ind w:left="230" w:hanging="187"/>
             </w:pPr>
             <w:r>
@@ -631,14 +827,14 @@
             </w:r>
             <w:r>
               <w:rPr>
-                <w:sz w:val="19"/>
+                <w:sz w:val="18"/>
               </w:rPr>
               <w:t>Led and coached 50+ representatives; hired, trained, and developed sales teams (Assistant Manager Jan 2021 - May 2022; Branch Manager Apr - Oct 2022)</w:t>
             </w:r>
           </w:p>
           <w:p>
             <w:pPr>
-              <w:spacing w:after="30"/>
+              <w:spacing w:after="20"/>
               <w:ind w:left="230" w:hanging="187"/>
             </w:pPr>
             <w:r>
@@ -646,14 +842,14 @@
             </w:r>
             <w:r>
               <w:rPr>
-                <w:sz w:val="19"/>
+                <w:sz w:val="18"/>
               </w:rPr>
               <w:t>Built an onboarding framework that trained 300 new hires in 3 days; implemented AI customer service and analytics</w:t>
             </w:r>
           </w:p>
           <w:p>
             <w:pPr>
-              <w:spacing w:after="30"/>
+              <w:spacing w:after="20"/>
               <w:ind w:left="230" w:hanging="187"/>
             </w:pPr>
             <w:r>
@@ -661,14 +857,14 @@
             </w:r>
             <w:r>
               <w:rPr>
-                <w:sz w:val="19"/>
+                <w:sz w:val="18"/>
               </w:rPr>
               <w:t>Continue as Event Sales Specialist and consultant on an as-needed basis</w:t>
             </w:r>
           </w:p>
           <w:p>
             <w:pPr>
-              <w:spacing w:after="0" w:before="120"/>
+              <w:spacing w:after="0" w:before="80"/>
             </w:pPr>
             <w:r>
               <w:rPr>
@@ -693,7 +889,7 @@
           </w:p>
           <w:p>
             <w:pPr>
-              <w:spacing w:after="30"/>
+              <w:spacing w:after="20"/>
               <w:ind w:left="230" w:hanging="187"/>
             </w:pPr>
             <w:r>
@@ -701,14 +897,14 @@
             </w:r>
             <w:r>
               <w:rPr>
-                <w:sz w:val="19"/>
+                <w:sz w:val="18"/>
               </w:rPr>
               <w:t>Conducted nutritional and mineral analyses; maintained lab and greenhouse safety standards</w:t>
             </w:r>
           </w:p>
           <w:p>
             <w:pPr>
-              <w:spacing w:after="0" w:before="120"/>
+              <w:spacing w:after="0" w:before="80"/>
             </w:pPr>
             <w:r>
               <w:rPr>
@@ -733,7 +929,7 @@
           </w:p>
           <w:p>
             <w:pPr>
-              <w:spacing w:after="30"/>
+              <w:spacing w:after="20"/>
               <w:ind w:left="230" w:hanging="187"/>
             </w:pPr>
             <w:r>
@@ -741,14 +937,14 @@
             </w:r>
             <w:r>
               <w:rPr>
-                <w:sz w:val="19"/>
+                <w:sz w:val="18"/>
               </w:rPr>
               <w:t>Assessed learning gaps and built structured improvement plans</w:t>
             </w:r>
           </w:p>
           <w:p>
             <w:pPr>
-              <w:spacing w:after="0" w:before="120"/>
+              <w:spacing w:after="0" w:before="80"/>
             </w:pPr>
             <w:r>
               <w:rPr>
@@ -773,7 +969,7 @@
           </w:p>
           <w:p>
             <w:pPr>
-              <w:spacing w:after="30"/>
+              <w:spacing w:after="20"/>
               <w:ind w:left="230" w:hanging="187"/>
             </w:pPr>
             <w:r>
@@ -781,257 +977,9 @@
             </w:r>
             <w:r>
               <w:rPr>
-                <w:sz w:val="19"/>
+                <w:sz w:val="18"/>
               </w:rPr>
               <w:t>Designed online course content for complex scientific topics</w:t>
-            </w:r>
-          </w:p>
-          <w:p>
-            <w:pPr>
-              <w:spacing w:after="60" w:before="180"/>
-            </w:pPr>
-            <w:r>
-              <w:rPr>
-                <w:b/>
-                <w:i w:val="0"/>
-                <w:sz w:val="20"/>
-                <w:spacing w:val="30"/>
-              </w:rPr>
-              <w:t>SELECTED PROJECTS</w:t>
-            </w:r>
-          </w:p>
-          <w:p>
-            <w:pPr>
-              <w:spacing w:after="30"/>
-              <w:ind w:left="230" w:hanging="187"/>
-            </w:pPr>
-            <w:r>
-              <w:t xml:space="preserve">•  </w:t>
-            </w:r>
-            <w:r>
-              <w:rPr>
-                <w:b/>
-                <w:sz w:val="19"/>
-              </w:rPr>
-              <w:t xml:space="preserve">Relocation Insights Application: </w:t>
-            </w:r>
-            <w:r>
-              <w:rPr>
-                <w:sz w:val="19"/>
-              </w:rPr>
-              <w:t xml:space="preserve">Conversational AI built with LangChain and Google Gen AI; 95% user satisfaction, real-time multi-API data. </w:t>
-            </w:r>
-            <w:hyperlink r:id="rId12">
-              <w:r>
-                <w:rPr>
-                  <w:color w:val="1155CC"/>
-                  <w:u w:val="single"/>
-                  <w:sz w:val="19"/>
-                </w:rPr>
-                <w:t xml:space="preserve">GitHub</w:t>
-              </w:r>
-            </w:hyperlink>
-          </w:p>
-          <w:p>
-            <w:pPr>
-              <w:spacing w:after="30"/>
-              <w:ind w:left="230" w:hanging="187"/>
-            </w:pPr>
-            <w:r>
-              <w:t xml:space="preserve">•  </w:t>
-            </w:r>
-            <w:r>
-              <w:rPr>
-                <w:b/>
-                <w:sz w:val="19"/>
-              </w:rPr>
-              <w:t xml:space="preserve">Olympic Swimming Analysis: </w:t>
-            </w:r>
-            <w:r>
-              <w:rPr>
-                <w:sz w:val="19"/>
-              </w:rPr>
-              <w:t xml:space="preserve">100+ years of Olympic data with forecasting and statistical modeling (Python, Pandas, Prophet). </w:t>
-            </w:r>
-            <w:hyperlink r:id="rId13">
-              <w:r>
-                <w:rPr>
-                  <w:color w:val="1155CC"/>
-                  <w:u w:val="single"/>
-                  <w:sz w:val="19"/>
-                </w:rPr>
-                <w:t xml:space="preserve">GitHub</w:t>
-              </w:r>
-            </w:hyperlink>
-          </w:p>
-          <w:p>
-            <w:pPr>
-              <w:spacing w:after="30"/>
-              <w:ind w:left="230" w:hanging="187"/>
-            </w:pPr>
-            <w:r>
-              <w:t xml:space="preserve">•  </w:t>
-            </w:r>
-            <w:r>
-              <w:rPr>
-                <w:b/>
-                <w:sz w:val="19"/>
-              </w:rPr>
-              <w:t xml:space="preserve">Banking Interface System: </w:t>
-            </w:r>
-            <w:r>
-              <w:rPr>
-                <w:sz w:val="19"/>
-              </w:rPr>
-              <w:t xml:space="preserve">Secure transaction system with error handling and conversational flows. </w:t>
-            </w:r>
-            <w:hyperlink r:id="rId14">
-              <w:r>
-                <w:rPr>
-                  <w:color w:val="1155CC"/>
-                  <w:u w:val="single"/>
-                  <w:sz w:val="19"/>
-                </w:rPr>
-                <w:t xml:space="preserve">GitHub</w:t>
-              </w:r>
-            </w:hyperlink>
-          </w:p>
-          <w:p>
-            <w:pPr>
-              <w:spacing w:after="30"/>
-              <w:ind w:left="230" w:hanging="187"/>
-            </w:pPr>
-            <w:r>
-              <w:t xml:space="preserve">•  </w:t>
-            </w:r>
-            <w:r>
-              <w:rPr>
-                <w:b/>
-                <w:sz w:val="19"/>
-              </w:rPr>
-              <w:t xml:space="preserve">Obesity Classification System: </w:t>
-            </w:r>
-            <w:r>
-              <w:rPr>
-                <w:sz w:val="19"/>
-              </w:rPr>
-              <w:t xml:space="preserve">ML model analyzing health factors. </w:t>
-            </w:r>
-            <w:hyperlink r:id="rId15">
-              <w:r>
-                <w:rPr>
-                  <w:color w:val="1155CC"/>
-                  <w:u w:val="single"/>
-                  <w:sz w:val="19"/>
-                </w:rPr>
-                <w:t xml:space="preserve">GitHub</w:t>
-              </w:r>
-            </w:hyperlink>
-          </w:p>
-          <w:p>
-            <w:pPr>
-              <w:spacing w:after="30"/>
-              <w:ind w:left="230" w:hanging="187"/>
-            </w:pPr>
-            <w:r>
-              <w:t xml:space="preserve">•  </w:t>
-            </w:r>
-            <w:r>
-              <w:rPr>
-                <w:b/>
-                <w:sz w:val="19"/>
-              </w:rPr>
-              <w:t xml:space="preserve">Indigenous Vegetables Research: </w:t>
-            </w:r>
-            <w:r>
-              <w:rPr>
-                <w:sz w:val="19"/>
-              </w:rPr>
-              <w:t xml:space="preserve">Nutritional analysis, data pipelines, and educational materials (Rutgers). </w:t>
-            </w:r>
-            <w:hyperlink r:id="rId16">
-              <w:r>
-                <w:rPr>
-                  <w:color w:val="1155CC"/>
-                  <w:u w:val="single"/>
-                  <w:sz w:val="19"/>
-                </w:rPr>
-                <w:t xml:space="preserve">View</w:t>
-              </w:r>
-            </w:hyperlink>
-          </w:p>
-          <w:p>
-            <w:pPr>
-              <w:spacing w:after="60" w:before="180"/>
-            </w:pPr>
-            <w:r>
-              <w:rPr>
-                <w:b/>
-                <w:i w:val="0"/>
-                <w:sz w:val="20"/>
-                <w:spacing w:val="30"/>
-              </w:rPr>
-              <w:t>ACHIEVEMENTS</w:t>
-            </w:r>
-          </w:p>
-          <w:p>
-            <w:pPr>
-              <w:spacing w:after="30"/>
-              <w:ind w:left="230" w:hanging="187"/>
-            </w:pPr>
-            <w:r>
-              <w:t xml:space="preserve">•  </w:t>
-            </w:r>
-            <w:r>
-              <w:rPr>
-                <w:sz w:val="19"/>
-              </w:rPr>
-              <w:t>Vector Marketing President's Club inductee</w:t>
-            </w:r>
-          </w:p>
-          <w:p>
-            <w:pPr>
-              <w:spacing w:after="30"/>
-              <w:ind w:left="230" w:hanging="187"/>
-            </w:pPr>
-            <w:r>
-              <w:t xml:space="preserve">•  </w:t>
-            </w:r>
-            <w:r>
-              <w:rPr>
-                <w:sz w:val="19"/>
-              </w:rPr>
-              <w:t>Nominee, 2018 Student Employee of the Year (top 60 of 12,500 student employees), Rutgers</w:t>
-            </w:r>
-          </w:p>
-          <w:p>
-            <w:pPr>
-              <w:spacing w:after="30"/>
-              <w:ind w:left="230" w:hanging="187"/>
-            </w:pPr>
-            <w:r>
-              <w:t xml:space="preserve">•  </w:t>
-            </w:r>
-            <w:r>
-              <w:rPr>
-                <w:sz w:val="19"/>
-              </w:rPr>
-              <w:t>Joyce Family Scholarship</w:t>
-            </w:r>
-          </w:p>
-          <w:p>
-            <w:pPr>
-              <w:spacing w:after="30"/>
-              <w:ind w:left="230" w:hanging="187"/>
-            </w:pPr>
-            <w:r>
-              <w:t xml:space="preserve">•  </w:t>
-            </w:r>
-            <w:r>
-              <w:rPr>
-                <w:sz w:val="19"/>
-              </w:rPr>
-              <w:t>Research: Catnip Oils (2019), Environmental Impact (2018), Indigenous Vegetables (2022), Nutritional Analysis (2024)</w:t>
             </w:r>
           </w:p>
         </w:tc>
@@ -1039,7 +987,7 @@
     </w:tbl>
     <w:sectPr>
       <w:pgSz w:w="12240" w:h="15840"/>
-      <w:pgMar w:top="576" w:right="576" w:bottom="576" w:left="576" w:header="720" w:footer="720" w:gutter="0"/>
+      <w:pgMar w:top="432" w:right="432" w:bottom="432" w:left="432" w:header="720" w:footer="720" w:gutter="0"/>
       <w:cols w:space="720"/>
       <w:docGrid w:linePitch="360"/>
     </w:sectPr>
@@ -1415,7 +1363,7 @@
     </w:pPr>
     <w:rPr>
       <w:rFonts w:ascii="Calibri" w:hAnsi="Calibri" w:eastAsia="Calibri"/>
-      <w:sz w:val="19"/>
+      <w:sz w:val="18"/>
     </w:rPr>
   </w:style>
   <w:style w:type="paragraph" w:styleId="Header">

</xml_diff>